<commit_message>
Monorepo consolidation + Documentation update (FAISS RAG, TTS/Translate, classification, approvals)
- Assimilated frontend into main repo (was separate gitlink)
- Updated NAYAM_Documentation.md + .docx + README.md:
  - RAG: TF-IDF -> FAISS + sentence-transformers (all-MiniLM-L6-v2, 384-dim)
  - Voice classification: disambiguation examples in LLM prompt
  - Documents page: user-overridable AI classification ('Create As' dropdown)
  - Issues + Documents: TTS and Translate buttons on detail modals
  - Config: EMBEDDING_MODEL/DIMENSIONS updated
  - Dependencies: faiss-cpu, sentence-transformers replace scikit-learn
- Single-repo setup instructions in README
</commit_message>
<xml_diff>
--- a/NAYAM_Documentation.docx
+++ b/NAYAM_Documentation.docx
@@ -29,7 +29,7 @@
         <w:rPr>
           <w:i/>
         </w:rPr>
-        <w:t>Version 2.0.0 | Python 3.13 | FastAPI 0.104 | Next.js 16 | Groq LLM | TF-IDF RAG | Whisper STT</w:t>
+        <w:t>Version 2.0.0 | Python 3.13 | FastAPI 0.104 | Next.js 16 | Groq LLM | FAISS + Sentence-Transformers RAG | Whisper STT</w:t>
       </w:r>
     </w:p>
     <w:p>
@@ -1217,7 +1217,7 @@
               <w:rPr>
                 <w:sz w:val="20"/>
               </w:rPr>
-              <w:t>Multi-agent framework, Groq LLM integration, RAG pipeline (TF-IDF), conversation memory, action approval workflow</w:t>
+              <w:t>Multi-agent framework, Groq LLM integration, RAG pipeline (FAISS + sentence-transformers), conversation memory, action approval workflow</w:t>
             </w:r>
           </w:p>
         </w:tc>
@@ -8792,7 +8792,7 @@
               <w:rPr>
                 <w:sz w:val="20"/>
               </w:rPr>
-              <w:t>Conversation storage + TF-IDF search</w:t>
+              <w:t>Conversation storage + FAISS dense vector RAG search</w:t>
             </w:r>
           </w:p>
         </w:tc>
@@ -10013,31 +10013,25 @@
         <w:br/>
         <w:t xml:space="preserve">       ▼</w:t>
         <w:br/>
-        <w:t xml:space="preserve">  Build corpus: [chunk_1, chunk_2, ..., chunk_N, query]</w:t>
+        <w:t xml:space="preserve">  generate_embedding(query)  ← sentence-transformers (all-MiniLM-L6-v2)</w:t>
         <w:br/>
         <w:t xml:space="preserve">       │</w:t>
         <w:br/>
         <w:t xml:space="preserve">       ▼</w:t>
         <w:br/>
-        <w:t xml:space="preserve">  TfidfVectorizer(stop_words="english", max_features=5000)</w:t>
+        <w:t xml:space="preserve">  Build FAISS IndexFlatIP(384)  ← Inner-product on L2-normalized vectors</w:t>
         <w:br/>
         <w:t xml:space="preserve">       │</w:t>
         <w:br/>
         <w:t xml:space="preserve">       ▼</w:t>
         <w:br/>
-        <w:t xml:space="preserve">  fit_transform(corpus)    ← Build TF-IDF matrix</w:t>
+        <w:t xml:space="preserve">  index.search(query_vector, top_k)</w:t>
         <w:br/>
         <w:t xml:space="preserve">       │</w:t>
         <w:br/>
         <w:t xml:space="preserve">       ▼</w:t>
         <w:br/>
-        <w:t xml:space="preserve">  cosine_similarity(query_vector, document_vectors)</w:t>
-        <w:br/>
-        <w:t xml:space="preserve">       │</w:t>
-        <w:br/>
-        <w:t xml:space="preserve">       ▼</w:t>
-        <w:br/>
-        <w:t xml:space="preserve">  Sort by score descending, take top-5 where score &gt; 0.02</w:t>
+        <w:t xml:space="preserve">  Filter results by score &gt; 0.15 threshold</w:t>
         <w:br/>
         <w:t xml:space="preserve">       │</w:t>
         <w:br/>
@@ -10060,12 +10054,13 @@
     </w:p>
     <w:p>
       <w:pPr/>
-      <w:r/>
+      <w:r>
+        <w:t>Why FAISS + Sentence-Transformers?</w:t>
+      </w:r>
       <w:r>
         <w:rPr>
           <w:b/>
         </w:rPr>
-        <w:t>Why TF-IDF over Vector Embeddings?</w:t>
       </w:r>
       <w:r/>
     </w:p>
@@ -10074,7 +10069,7 @@
         <w:pStyle w:val="ListBullet"/>
       </w:pPr>
       <w:r>
-        <w:t>Zero external dependency (no embedding API needed)</w:t>
+        <w:t>Semantic understanding — Dense embeddings capture meaning, not just keyword overlap</w:t>
       </w:r>
     </w:p>
     <w:p>
@@ -10082,7 +10077,7 @@
         <w:pStyle w:val="ListBullet"/>
       </w:pPr>
       <w:r>
-        <w:t>Works offline (scikit-learn is local)</w:t>
+        <w:t>Fast similarity search — FAISS IndexFlatIP provides efficient nearest-neighbor search</w:t>
       </w:r>
     </w:p>
     <w:p>
@@ -10090,7 +10085,7 @@
         <w:pStyle w:val="ListBullet"/>
       </w:pPr>
       <w:r>
-        <w:t>Effective for domain-specific governance terminology</w:t>
+        <w:t>Better recall — Handles paraphrasing, synonyms, and multilingual queries</w:t>
       </w:r>
     </w:p>
     <w:p>
@@ -10098,7 +10093,7 @@
         <w:pStyle w:val="ListBullet"/>
       </w:pPr>
       <w:r>
-        <w:t>Fast for the expected corpus size (hundreds to low thousands of chunks)</w:t>
+        <w:t>Compact model — all-MiniLM-L6-v2 runs locally (CPU) with 384-dim vectors</w:t>
       </w:r>
     </w:p>
     <w:p>
@@ -10407,16 +10402,15 @@
       <w:pPr>
         <w:pStyle w:val="ListBullet"/>
       </w:pPr>
-      <w:r/>
+      <w:r>
+        <w:t>Chunk size: 400 words (optimized for dense embedding retrieval)</w:t>
+      </w:r>
       <w:r>
         <w:rPr>
           <w:b/>
         </w:rPr>
-        <w:t>Chunk size:</w:t>
-      </w:r>
-      <w:r>
-        <w:t xml:space="preserve"> 400 words (optimized for TF-IDF relevance)</w:t>
-      </w:r>
+      </w:r>
+      <w:r/>
     </w:p>
     <w:p>
       <w:pPr>
@@ -10792,42 +10786,37 @@
       <w:pPr>
         <w:pStyle w:val="ListBullet"/>
       </w:pPr>
-      <w:r/>
+      <w:r>
+        <w:t>search_similar_context() — Vector-based similarity search (placeholder for future extensions)</w:t>
+      </w:r>
       <w:r>
         <w:rPr>
           <w:rFonts w:ascii="Consolas" w:hAnsi="Consolas"/>
           <w:sz w:val="20"/>
         </w:rPr>
-        <w:t>search_similar_context()</w:t>
-      </w:r>
-      <w:r>
-        <w:t xml:space="preserve"> — Vector-based similarity search (placeholder for dense embeddings)</w:t>
-      </w:r>
+      </w:r>
+      <w:r/>
     </w:p>
     <w:p>
       <w:pPr>
         <w:pStyle w:val="ListBullet"/>
       </w:pPr>
-      <w:r/>
+      <w:r>
+        <w:t>search_by_text() — Primary RAG retrieval method using FAISS IndexFlatIP with dense embeddings (see §4.4)</w:t>
+      </w:r>
       <w:r>
         <w:rPr>
           <w:rFonts w:ascii="Consolas" w:hAnsi="Consolas"/>
           <w:sz w:val="20"/>
         </w:rPr>
-        <w:t>search_by_text()</w:t>
-      </w:r>
-      <w:r>
-        <w:t xml:space="preserve"> — </w:t>
-      </w:r>
+      </w:r>
+      <w:r/>
       <w:r>
         <w:rPr>
           <w:b/>
         </w:rPr>
-        <w:t>Primary RAG retrieval method</w:t>
-      </w:r>
-      <w:r>
-        <w:t xml:space="preserve"> using TF-IDF (see §4.4)</w:t>
-      </w:r>
+      </w:r>
+      <w:r/>
     </w:p>
     <w:p>
       <w:pPr>
@@ -13270,7 +13259,7 @@
               <w:rPr>
                 <w:sz w:val="20"/>
               </w:rPr>
-              <w:t>Issue list with status/priority/department filters; create with citizen selector; status updates</w:t>
+              <w:t>Issue list with status/priority/department filters; create with citizen selector; voice-based issue creation with Bhashini ASR and translate-to-English; TTS and Translate on detail modal</w:t>
             </w:r>
           </w:p>
         </w:tc>
@@ -13314,7 +13303,7 @@
               <w:rPr>
                 <w:sz w:val="20"/>
               </w:rPr>
-              <w:t>Document list with file upload dialog; shows extracted text + AI summary; supports PDF/DOCX/TXT; 🎤 voice recording</w:t>
+              <w:t>Document list with file upload dialog; shows extracted text + AI summary; supports PDF/DOCX/TXT; Bhashini ASR voice ingest with 12-language selector; user-overridable AI classification ("Create As" dropdown); TTS and Translate on detail modal</w:t>
             </w:r>
           </w:p>
         </w:tc>
@@ -22289,7 +22278,7 @@
               <w:rPr>
                 <w:sz w:val="20"/>
               </w:rPr>
-              <w:t>`"tfidf-local"`</w:t>
+              <w:t>`"all-MiniLM-L6-v2"`</w:t>
             </w:r>
           </w:p>
         </w:tc>
@@ -22317,7 +22306,7 @@
               <w:rPr>
                 <w:sz w:val="20"/>
               </w:rPr>
-              <w:t>Embedding provider</w:t>
+              <w:t>Embedding model (sentence-transformers)</w:t>
             </w:r>
           </w:p>
         </w:tc>
@@ -22361,7 +22350,7 @@
               <w:rPr>
                 <w:sz w:val="20"/>
               </w:rPr>
-              <w:t>`1`</w:t>
+              <w:t>`384`</w:t>
             </w:r>
           </w:p>
         </w:tc>
@@ -24680,7 +24669,11 @@
         <w:br/>
         <w:t>groq==0.25.0</w:t>
         <w:br/>
-        <w:t>scikit-learn==1.4.0</w:t>
+        <w:t>faiss-cpu==1.13.2</w:t>
+        <w:br/>
+        <w:t>sentence-transformers==5.2.3</w:t>
+        <w:br/>
+        <w:t>1.4.0</w:t>
         <w:br/>
         <w:br/>
         <w:t># Document Processing</w:t>

</xml_diff>